<commit_message>
docs: map the lecturer's six midterm requirements to report sections
Adds a table in section 1.5 (report, now 48 pages) and rows in the presentation
guide pointing to where process, test-case list, cost, plan, method and
technique are covered.

Co-Authored-By: Claude Sonnet 5.5 <noreply@anthropic.com>
</commit_message>
<xml_diff>
--- a/docs/BAO_CAO_GIUA_KY_THEO_MAU.docx
+++ b/docs/BAO_CAO_GIUA_KY_THEO_MAU.docx
@@ -4035,6 +4035,827 @@
     </w:p>
     <w:p>
       <w:pPr>
+        <w:ind w:firstLine="720"/>
+        <w:jc w:val="both"/>
+      </w:pPr>
+      <w:r>
+        <w:rPr>
+          <w:rFonts w:ascii="Times New Roman" w:cs="Times New Roman" w:eastAsia="Times New Roman" w:hAnsi="Times New Roman"/>
+        </w:rPr>
+        <w:t xml:space="preserve">Ngoài các phần A đến H, giảng viên yêu cầu báo cáo giữa kỳ nêu rõ sáu nội dung dưới đây. Bảng 3 chỉ ra vị trí của từng nội dung trong báo cáo.</w:t>
+      </w:r>
+    </w:p>
+    <w:tbl>
+      <w:tblPr>
+        <w:tblW w:type="dxa" w:w="8787"/>
+        <w:tblBorders>
+          <w:top w:val="single" w:color="auto" w:sz="4"/>
+          <w:left w:val="single" w:color="auto" w:sz="4"/>
+          <w:bottom w:val="single" w:color="auto" w:sz="4"/>
+          <w:right w:val="single" w:color="auto" w:sz="4"/>
+          <w:insideH w:val="single" w:color="auto" w:sz="4"/>
+          <w:insideV w:val="single" w:color="auto" w:sz="4"/>
+        </w:tblBorders>
+      </w:tblPr>
+      <w:tblGrid>
+        <w:gridCol w:w="2433"/>
+        <w:gridCol w:w="1622"/>
+        <w:gridCol w:w="4732"/>
+      </w:tblGrid>
+      <w:tr>
+        <w:trPr>
+          <w:cantSplit/>
+          <w:tblHeader/>
+        </w:trPr>
+        <w:tc>
+          <w:tcPr>
+            <w:tcW w:type="dxa" w:w="2433"/>
+            <w:tcBorders>
+              <w:top w:val="single" w:color="000000" w:sz="4"/>
+              <w:left w:val="single" w:color="000000" w:sz="4"/>
+              <w:bottom w:val="single" w:color="000000" w:sz="4"/>
+              <w:right w:val="single" w:color="000000" w:sz="4"/>
+            </w:tcBorders>
+            <w:shd w:fill="D9D9D9" w:val="clear"/>
+            <w:tcMar>
+              <w:top w:type="dxa" w:w="40"/>
+              <w:left w:type="dxa" w:w="90"/>
+              <w:bottom w:type="dxa" w:w="40"/>
+              <w:right w:type="dxa" w:w="90"/>
+            </w:tcMar>
+            <w:vAlign w:val="center"/>
+          </w:tcPr>
+          <w:p>
+            <w:pPr>
+              <w:spacing w:after="0" w:line="252"/>
+              <w:jc w:val="left"/>
+            </w:pPr>
+            <w:r>
+              <w:rPr>
+                <w:rFonts w:ascii="Times New Roman" w:cs="Times New Roman" w:eastAsia="Times New Roman" w:hAnsi="Times New Roman"/>
+                <w:b/>
+                <w:bCs/>
+                <w:sz w:val="22"/>
+                <w:szCs w:val="22"/>
+              </w:rPr>
+              <w:t xml:space="preserve">Yêu cầu của giảng viên</w:t>
+            </w:r>
+          </w:p>
+        </w:tc>
+        <w:tc>
+          <w:tcPr>
+            <w:tcW w:type="dxa" w:w="1622"/>
+            <w:tcBorders>
+              <w:top w:val="single" w:color="000000" w:sz="4"/>
+              <w:left w:val="single" w:color="000000" w:sz="4"/>
+              <w:bottom w:val="single" w:color="000000" w:sz="4"/>
+              <w:right w:val="single" w:color="000000" w:sz="4"/>
+            </w:tcBorders>
+            <w:shd w:fill="D9D9D9" w:val="clear"/>
+            <w:tcMar>
+              <w:top w:type="dxa" w:w="40"/>
+              <w:left w:type="dxa" w:w="90"/>
+              <w:bottom w:type="dxa" w:w="40"/>
+              <w:right w:type="dxa" w:w="90"/>
+            </w:tcMar>
+            <w:vAlign w:val="center"/>
+          </w:tcPr>
+          <w:p>
+            <w:pPr>
+              <w:spacing w:after="0" w:line="252"/>
+              <w:jc w:val="center"/>
+            </w:pPr>
+            <w:r>
+              <w:rPr>
+                <w:rFonts w:ascii="Times New Roman" w:cs="Times New Roman" w:eastAsia="Times New Roman" w:hAnsi="Times New Roman"/>
+                <w:b/>
+                <w:bCs/>
+                <w:sz w:val="22"/>
+                <w:szCs w:val="22"/>
+              </w:rPr>
+              <w:t xml:space="preserve">Mục trong báo cáo</w:t>
+            </w:r>
+          </w:p>
+        </w:tc>
+        <w:tc>
+          <w:tcPr>
+            <w:tcW w:type="dxa" w:w="4732"/>
+            <w:tcBorders>
+              <w:top w:val="single" w:color="000000" w:sz="4"/>
+              <w:left w:val="single" w:color="000000" w:sz="4"/>
+              <w:bottom w:val="single" w:color="000000" w:sz="4"/>
+              <w:right w:val="single" w:color="000000" w:sz="4"/>
+            </w:tcBorders>
+            <w:shd w:fill="D9D9D9" w:val="clear"/>
+            <w:tcMar>
+              <w:top w:type="dxa" w:w="40"/>
+              <w:left w:type="dxa" w:w="90"/>
+              <w:bottom w:type="dxa" w:w="40"/>
+              <w:right w:type="dxa" w:w="90"/>
+            </w:tcMar>
+            <w:vAlign w:val="center"/>
+          </w:tcPr>
+          <w:p>
+            <w:pPr>
+              <w:spacing w:after="0" w:line="252"/>
+              <w:jc w:val="left"/>
+            </w:pPr>
+            <w:r>
+              <w:rPr>
+                <w:rFonts w:ascii="Times New Roman" w:cs="Times New Roman" w:eastAsia="Times New Roman" w:hAnsi="Times New Roman"/>
+                <w:b/>
+                <w:bCs/>
+                <w:sz w:val="22"/>
+                <w:szCs w:val="22"/>
+              </w:rPr>
+              <w:t xml:space="preserve">Tóm tắt</w:t>
+            </w:r>
+          </w:p>
+        </w:tc>
+      </w:tr>
+      <w:tr>
+        <w:trPr>
+          <w:cantSplit/>
+          <w:tblHeader w:val="off"/>
+        </w:trPr>
+        <w:tc>
+          <w:tcPr>
+            <w:tcW w:type="dxa" w:w="2433"/>
+            <w:tcBorders>
+              <w:top w:val="single" w:color="000000" w:sz="4"/>
+              <w:left w:val="single" w:color="000000" w:sz="4"/>
+              <w:bottom w:val="single" w:color="000000" w:sz="4"/>
+              <w:right w:val="single" w:color="000000" w:sz="4"/>
+            </w:tcBorders>
+            <w:tcMar>
+              <w:top w:type="dxa" w:w="40"/>
+              <w:left w:type="dxa" w:w="90"/>
+              <w:bottom w:type="dxa" w:w="40"/>
+              <w:right w:type="dxa" w:w="90"/>
+            </w:tcMar>
+            <w:vAlign w:val="center"/>
+          </w:tcPr>
+          <w:p>
+            <w:pPr>
+              <w:spacing w:after="0" w:line="252"/>
+              <w:jc w:val="left"/>
+            </w:pPr>
+            <w:r>
+              <w:rPr>
+                <w:rFonts w:ascii="Times New Roman" w:cs="Times New Roman" w:eastAsia="Times New Roman" w:hAnsi="Times New Roman"/>
+                <w:sz w:val="22"/>
+                <w:szCs w:val="22"/>
+              </w:rPr>
+              <w:t xml:space="preserve">Đưa ra quy trình test</w:t>
+            </w:r>
+          </w:p>
+        </w:tc>
+        <w:tc>
+          <w:tcPr>
+            <w:tcW w:type="dxa" w:w="1622"/>
+            <w:tcBorders>
+              <w:top w:val="single" w:color="000000" w:sz="4"/>
+              <w:left w:val="single" w:color="000000" w:sz="4"/>
+              <w:bottom w:val="single" w:color="000000" w:sz="4"/>
+              <w:right w:val="single" w:color="000000" w:sz="4"/>
+            </w:tcBorders>
+            <w:tcMar>
+              <w:top w:type="dxa" w:w="40"/>
+              <w:left w:type="dxa" w:w="90"/>
+              <w:bottom w:type="dxa" w:w="40"/>
+              <w:right w:type="dxa" w:w="90"/>
+            </w:tcMar>
+            <w:vAlign w:val="center"/>
+          </w:tcPr>
+          <w:p>
+            <w:pPr>
+              <w:spacing w:after="0" w:line="252"/>
+              <w:jc w:val="center"/>
+            </w:pPr>
+            <w:r>
+              <w:rPr>
+                <w:rFonts w:ascii="Times New Roman" w:cs="Times New Roman" w:eastAsia="Times New Roman" w:hAnsi="Times New Roman"/>
+                <w:sz w:val="22"/>
+                <w:szCs w:val="22"/>
+              </w:rPr>
+              <w:t xml:space="preserve">3.3.4, 3.3.5</w:t>
+            </w:r>
+          </w:p>
+        </w:tc>
+        <w:tc>
+          <w:tcPr>
+            <w:tcW w:type="dxa" w:w="4732"/>
+            <w:tcBorders>
+              <w:top w:val="single" w:color="000000" w:sz="4"/>
+              <w:left w:val="single" w:color="000000" w:sz="4"/>
+              <w:bottom w:val="single" w:color="000000" w:sz="4"/>
+              <w:right w:val="single" w:color="000000" w:sz="4"/>
+            </w:tcBorders>
+            <w:tcMar>
+              <w:top w:type="dxa" w:w="40"/>
+              <w:left w:type="dxa" w:w="90"/>
+              <w:bottom w:type="dxa" w:w="40"/>
+              <w:right w:type="dxa" w:w="90"/>
+            </w:tcMar>
+            <w:vAlign w:val="center"/>
+          </w:tcPr>
+          <w:p>
+            <w:pPr>
+              <w:spacing w:after="0" w:line="252"/>
+              <w:jc w:val="left"/>
+            </w:pPr>
+            <w:r>
+              <w:rPr>
+                <w:rFonts w:ascii="Times New Roman" w:cs="Times New Roman" w:eastAsia="Times New Roman" w:hAnsi="Times New Roman"/>
+                <w:sz w:val="22"/>
+                <w:szCs w:val="22"/>
+              </w:rPr>
+              <w:t xml:space="preserve">Quy trình 7 bước, tiêu chí pass/fail, nhóm đối chứng tuần tự</w:t>
+            </w:r>
+          </w:p>
+        </w:tc>
+      </w:tr>
+      <w:tr>
+        <w:trPr>
+          <w:cantSplit/>
+          <w:tblHeader w:val="off"/>
+        </w:trPr>
+        <w:tc>
+          <w:tcPr>
+            <w:tcW w:type="dxa" w:w="2433"/>
+            <w:tcBorders>
+              <w:top w:val="single" w:color="000000" w:sz="4"/>
+              <w:left w:val="single" w:color="000000" w:sz="4"/>
+              <w:bottom w:val="single" w:color="000000" w:sz="4"/>
+              <w:right w:val="single" w:color="000000" w:sz="4"/>
+            </w:tcBorders>
+            <w:tcMar>
+              <w:top w:type="dxa" w:w="40"/>
+              <w:left w:type="dxa" w:w="90"/>
+              <w:bottom w:type="dxa" w:w="40"/>
+              <w:right w:type="dxa" w:w="90"/>
+            </w:tcMar>
+            <w:vAlign w:val="center"/>
+          </w:tcPr>
+          <w:p>
+            <w:pPr>
+              <w:spacing w:after="0" w:line="252"/>
+              <w:jc w:val="left"/>
+            </w:pPr>
+            <w:r>
+              <w:rPr>
+                <w:rFonts w:ascii="Times New Roman" w:cs="Times New Roman" w:eastAsia="Times New Roman" w:hAnsi="Times New Roman"/>
+                <w:sz w:val="22"/>
+                <w:szCs w:val="22"/>
+              </w:rPr>
+              <w:t xml:space="preserve">Danh sách test case là gì</w:t>
+            </w:r>
+          </w:p>
+        </w:tc>
+        <w:tc>
+          <w:tcPr>
+            <w:tcW w:type="dxa" w:w="1622"/>
+            <w:tcBorders>
+              <w:top w:val="single" w:color="000000" w:sz="4"/>
+              <w:left w:val="single" w:color="000000" w:sz="4"/>
+              <w:bottom w:val="single" w:color="000000" w:sz="4"/>
+              <w:right w:val="single" w:color="000000" w:sz="4"/>
+            </w:tcBorders>
+            <w:tcMar>
+              <w:top w:type="dxa" w:w="40"/>
+              <w:left w:type="dxa" w:w="90"/>
+              <w:bottom w:type="dxa" w:w="40"/>
+              <w:right w:type="dxa" w:w="90"/>
+            </w:tcMar>
+            <w:vAlign w:val="center"/>
+          </w:tcPr>
+          <w:p>
+            <w:pPr>
+              <w:spacing w:after="0" w:line="252"/>
+              <w:jc w:val="center"/>
+            </w:pPr>
+            <w:r>
+              <w:rPr>
+                <w:rFonts w:ascii="Times New Roman" w:cs="Times New Roman" w:eastAsia="Times New Roman" w:hAnsi="Times New Roman"/>
+                <w:sz w:val="22"/>
+                <w:szCs w:val="22"/>
+              </w:rPr>
+              <w:t xml:space="preserve">3.3.6</w:t>
+            </w:r>
+          </w:p>
+        </w:tc>
+        <w:tc>
+          <w:tcPr>
+            <w:tcW w:type="dxa" w:w="4732"/>
+            <w:tcBorders>
+              <w:top w:val="single" w:color="000000" w:sz="4"/>
+              <w:left w:val="single" w:color="000000" w:sz="4"/>
+              <w:bottom w:val="single" w:color="000000" w:sz="4"/>
+              <w:right w:val="single" w:color="000000" w:sz="4"/>
+            </w:tcBorders>
+            <w:tcMar>
+              <w:top w:type="dxa" w:w="40"/>
+              <w:left w:type="dxa" w:w="90"/>
+              <w:bottom w:type="dxa" w:w="40"/>
+              <w:right w:type="dxa" w:w="90"/>
+            </w:tcMar>
+            <w:vAlign w:val="center"/>
+          </w:tcPr>
+          <w:p>
+            <w:pPr>
+              <w:spacing w:after="0" w:line="252"/>
+              <w:jc w:val="left"/>
+            </w:pPr>
+            <w:r>
+              <w:rPr>
+                <w:rFonts w:ascii="Times New Roman" w:cs="Times New Roman" w:eastAsia="Times New Roman" w:hAnsi="Times New Roman"/>
+                <w:sz w:val="22"/>
+                <w:szCs w:val="22"/>
+              </w:rPr>
+              <w:t xml:space="preserve">8 test case TC-01 đến TC-08, mỗi test case có đặc tả đầy đủ tiền điều kiện, input, kết quả mong đợi, dữ liệu</w:t>
+            </w:r>
+          </w:p>
+        </w:tc>
+      </w:tr>
+      <w:tr>
+        <w:trPr>
+          <w:cantSplit/>
+          <w:tblHeader w:val="off"/>
+        </w:trPr>
+        <w:tc>
+          <w:tcPr>
+            <w:tcW w:type="dxa" w:w="2433"/>
+            <w:tcBorders>
+              <w:top w:val="single" w:color="000000" w:sz="4"/>
+              <w:left w:val="single" w:color="000000" w:sz="4"/>
+              <w:bottom w:val="single" w:color="000000" w:sz="4"/>
+              <w:right w:val="single" w:color="000000" w:sz="4"/>
+            </w:tcBorders>
+            <w:tcMar>
+              <w:top w:type="dxa" w:w="40"/>
+              <w:left w:type="dxa" w:w="90"/>
+              <w:bottom w:type="dxa" w:w="40"/>
+              <w:right w:type="dxa" w:w="90"/>
+            </w:tcMar>
+            <w:vAlign w:val="center"/>
+          </w:tcPr>
+          <w:p>
+            <w:pPr>
+              <w:spacing w:after="0" w:line="252"/>
+              <w:jc w:val="left"/>
+            </w:pPr>
+            <w:r>
+              <w:rPr>
+                <w:rFonts w:ascii="Times New Roman" w:cs="Times New Roman" w:eastAsia="Times New Roman" w:hAnsi="Times New Roman"/>
+                <w:sz w:val="22"/>
+                <w:szCs w:val="22"/>
+              </w:rPr>
+              <w:t xml:space="preserve">Chi phí cho việc test</w:t>
+            </w:r>
+          </w:p>
+        </w:tc>
+        <w:tc>
+          <w:tcPr>
+            <w:tcW w:type="dxa" w:w="1622"/>
+            <w:tcBorders>
+              <w:top w:val="single" w:color="000000" w:sz="4"/>
+              <w:left w:val="single" w:color="000000" w:sz="4"/>
+              <w:bottom w:val="single" w:color="000000" w:sz="4"/>
+              <w:right w:val="single" w:color="000000" w:sz="4"/>
+            </w:tcBorders>
+            <w:tcMar>
+              <w:top w:type="dxa" w:w="40"/>
+              <w:left w:type="dxa" w:w="90"/>
+              <w:bottom w:type="dxa" w:w="40"/>
+              <w:right w:type="dxa" w:w="90"/>
+            </w:tcMar>
+            <w:vAlign w:val="center"/>
+          </w:tcPr>
+          <w:p>
+            <w:pPr>
+              <w:spacing w:after="0" w:line="252"/>
+              <w:jc w:val="center"/>
+            </w:pPr>
+            <w:r>
+              <w:rPr>
+                <w:rFonts w:ascii="Times New Roman" w:cs="Times New Roman" w:eastAsia="Times New Roman" w:hAnsi="Times New Roman"/>
+                <w:sz w:val="22"/>
+                <w:szCs w:val="22"/>
+              </w:rPr>
+              <w:t xml:space="preserve">4.4.4</w:t>
+            </w:r>
+          </w:p>
+        </w:tc>
+        <w:tc>
+          <w:tcPr>
+            <w:tcW w:type="dxa" w:w="4732"/>
+            <w:tcBorders>
+              <w:top w:val="single" w:color="000000" w:sz="4"/>
+              <w:left w:val="single" w:color="000000" w:sz="4"/>
+              <w:bottom w:val="single" w:color="000000" w:sz="4"/>
+              <w:right w:val="single" w:color="000000" w:sz="4"/>
+            </w:tcBorders>
+            <w:tcMar>
+              <w:top w:type="dxa" w:w="40"/>
+              <w:left w:type="dxa" w:w="90"/>
+              <w:bottom w:type="dxa" w:w="40"/>
+              <w:right w:type="dxa" w:w="90"/>
+            </w:tcMar>
+            <w:vAlign w:val="center"/>
+          </w:tcPr>
+          <w:p>
+            <w:pPr>
+              <w:spacing w:after="0" w:line="252"/>
+              <w:jc w:val="left"/>
+            </w:pPr>
+            <w:r>
+              <w:rPr>
+                <w:rFonts w:ascii="Times New Roman" w:cs="Times New Roman" w:eastAsia="Times New Roman" w:hAnsi="Times New Roman"/>
+                <w:sz w:val="22"/>
+                <w:szCs w:val="22"/>
+              </w:rPr>
+              <w:t xml:space="preserve">0 đồng; 1 140 request, 176 giây máy cho lượt chính thức; ước lượng nhân lực 34 đến 46 giờ</w:t>
+            </w:r>
+          </w:p>
+        </w:tc>
+      </w:tr>
+      <w:tr>
+        <w:trPr>
+          <w:cantSplit/>
+          <w:tblHeader w:val="off"/>
+        </w:trPr>
+        <w:tc>
+          <w:tcPr>
+            <w:tcW w:type="dxa" w:w="2433"/>
+            <w:tcBorders>
+              <w:top w:val="single" w:color="000000" w:sz="4"/>
+              <w:left w:val="single" w:color="000000" w:sz="4"/>
+              <w:bottom w:val="single" w:color="000000" w:sz="4"/>
+              <w:right w:val="single" w:color="000000" w:sz="4"/>
+            </w:tcBorders>
+            <w:tcMar>
+              <w:top w:type="dxa" w:w="40"/>
+              <w:left w:type="dxa" w:w="90"/>
+              <w:bottom w:type="dxa" w:w="40"/>
+              <w:right w:type="dxa" w:w="90"/>
+            </w:tcMar>
+            <w:vAlign w:val="center"/>
+          </w:tcPr>
+          <w:p>
+            <w:pPr>
+              <w:spacing w:after="0" w:line="252"/>
+              <w:jc w:val="left"/>
+            </w:pPr>
+            <w:r>
+              <w:rPr>
+                <w:rFonts w:ascii="Times New Roman" w:cs="Times New Roman" w:eastAsia="Times New Roman" w:hAnsi="Times New Roman"/>
+                <w:sz w:val="22"/>
+                <w:szCs w:val="22"/>
+              </w:rPr>
+              <w:t xml:space="preserve">Nêu kế hoạch test (giữa kỳ)</w:t>
+            </w:r>
+          </w:p>
+        </w:tc>
+        <w:tc>
+          <w:tcPr>
+            <w:tcW w:type="dxa" w:w="1622"/>
+            <w:tcBorders>
+              <w:top w:val="single" w:color="000000" w:sz="4"/>
+              <w:left w:val="single" w:color="000000" w:sz="4"/>
+              <w:bottom w:val="single" w:color="000000" w:sz="4"/>
+              <w:right w:val="single" w:color="000000" w:sz="4"/>
+            </w:tcBorders>
+            <w:tcMar>
+              <w:top w:type="dxa" w:w="40"/>
+              <w:left w:type="dxa" w:w="90"/>
+              <w:bottom w:type="dxa" w:w="40"/>
+              <w:right w:type="dxa" w:w="90"/>
+            </w:tcMar>
+            <w:vAlign w:val="center"/>
+          </w:tcPr>
+          <w:p>
+            <w:pPr>
+              <w:spacing w:after="0" w:line="252"/>
+              <w:jc w:val="center"/>
+            </w:pPr>
+            <w:r>
+              <w:rPr>
+                <w:rFonts w:ascii="Times New Roman" w:cs="Times New Roman" w:eastAsia="Times New Roman" w:hAnsi="Times New Roman"/>
+                <w:sz w:val="22"/>
+                <w:szCs w:val="22"/>
+              </w:rPr>
+              <w:t xml:space="preserve">3.3.2, 3.3.3, 3.4</w:t>
+            </w:r>
+          </w:p>
+        </w:tc>
+        <w:tc>
+          <w:tcPr>
+            <w:tcW w:type="dxa" w:w="4732"/>
+            <w:tcBorders>
+              <w:top w:val="single" w:color="000000" w:sz="4"/>
+              <w:left w:val="single" w:color="000000" w:sz="4"/>
+              <w:bottom w:val="single" w:color="000000" w:sz="4"/>
+              <w:right w:val="single" w:color="000000" w:sz="4"/>
+            </w:tcBorders>
+            <w:tcMar>
+              <w:top w:type="dxa" w:w="40"/>
+              <w:left w:type="dxa" w:w="90"/>
+              <w:bottom w:type="dxa" w:w="40"/>
+              <w:right w:type="dxa" w:w="90"/>
+            </w:tcMar>
+            <w:vAlign w:val="center"/>
+          </w:tcPr>
+          <w:p>
+            <w:pPr>
+              <w:spacing w:after="0" w:line="252"/>
+              <w:jc w:val="left"/>
+            </w:pPr>
+            <w:r>
+              <w:rPr>
+                <w:rFonts w:ascii="Times New Roman" w:cs="Times New Roman" w:eastAsia="Times New Roman" w:hAnsi="Times New Roman"/>
+                <w:sz w:val="22"/>
+                <w:szCs w:val="22"/>
+              </w:rPr>
+              <w:t xml:space="preserve">Phạm vi, giả định, rủi ro, lịch, tính khả thi và đề nghị duyệt</w:t>
+            </w:r>
+          </w:p>
+        </w:tc>
+      </w:tr>
+      <w:tr>
+        <w:trPr>
+          <w:cantSplit/>
+          <w:tblHeader w:val="off"/>
+        </w:trPr>
+        <w:tc>
+          <w:tcPr>
+            <w:tcW w:type="dxa" w:w="2433"/>
+            <w:tcBorders>
+              <w:top w:val="single" w:color="000000" w:sz="4"/>
+              <w:left w:val="single" w:color="000000" w:sz="4"/>
+              <w:bottom w:val="single" w:color="000000" w:sz="4"/>
+              <w:right w:val="single" w:color="000000" w:sz="4"/>
+            </w:tcBorders>
+            <w:tcMar>
+              <w:top w:type="dxa" w:w="40"/>
+              <w:left w:type="dxa" w:w="90"/>
+              <w:bottom w:type="dxa" w:w="40"/>
+              <w:right w:type="dxa" w:w="90"/>
+            </w:tcMar>
+            <w:vAlign w:val="center"/>
+          </w:tcPr>
+          <w:p>
+            <w:pPr>
+              <w:spacing w:after="0" w:line="252"/>
+              <w:jc w:val="left"/>
+            </w:pPr>
+            <w:r>
+              <w:rPr>
+                <w:rFonts w:ascii="Times New Roman" w:cs="Times New Roman" w:eastAsia="Times New Roman" w:hAnsi="Times New Roman"/>
+                <w:sz w:val="22"/>
+                <w:szCs w:val="22"/>
+              </w:rPr>
+              <w:t xml:space="preserve">Test như thế nào</w:t>
+            </w:r>
+          </w:p>
+        </w:tc>
+        <w:tc>
+          <w:tcPr>
+            <w:tcW w:type="dxa" w:w="1622"/>
+            <w:tcBorders>
+              <w:top w:val="single" w:color="000000" w:sz="4"/>
+              <w:left w:val="single" w:color="000000" w:sz="4"/>
+              <w:bottom w:val="single" w:color="000000" w:sz="4"/>
+              <w:right w:val="single" w:color="000000" w:sz="4"/>
+            </w:tcBorders>
+            <w:tcMar>
+              <w:top w:type="dxa" w:w="40"/>
+              <w:left w:type="dxa" w:w="90"/>
+              <w:bottom w:type="dxa" w:w="40"/>
+              <w:right w:type="dxa" w:w="90"/>
+            </w:tcMar>
+            <w:vAlign w:val="center"/>
+          </w:tcPr>
+          <w:p>
+            <w:pPr>
+              <w:spacing w:after="0" w:line="252"/>
+              <w:jc w:val="center"/>
+            </w:pPr>
+            <w:r>
+              <w:rPr>
+                <w:rFonts w:ascii="Times New Roman" w:cs="Times New Roman" w:eastAsia="Times New Roman" w:hAnsi="Times New Roman"/>
+                <w:sz w:val="22"/>
+                <w:szCs w:val="22"/>
+              </w:rPr>
+              <w:t xml:space="preserve">4.3, 4.4</w:t>
+            </w:r>
+          </w:p>
+        </w:tc>
+        <w:tc>
+          <w:tcPr>
+            <w:tcW w:type="dxa" w:w="4732"/>
+            <w:tcBorders>
+              <w:top w:val="single" w:color="000000" w:sz="4"/>
+              <w:left w:val="single" w:color="000000" w:sz="4"/>
+              <w:bottom w:val="single" w:color="000000" w:sz="4"/>
+              <w:right w:val="single" w:color="000000" w:sz="4"/>
+            </w:tcBorders>
+            <w:tcMar>
+              <w:top w:type="dxa" w:w="40"/>
+              <w:left w:type="dxa" w:w="90"/>
+              <w:bottom w:type="dxa" w:w="40"/>
+              <w:right w:type="dxa" w:w="90"/>
+            </w:tcMar>
+            <w:vAlign w:val="center"/>
+          </w:tcPr>
+          <w:p>
+            <w:pPr>
+              <w:spacing w:after="0" w:line="252"/>
+              <w:jc w:val="left"/>
+            </w:pPr>
+            <w:r>
+              <w:rPr>
+                <w:rFonts w:ascii="Times New Roman" w:cs="Times New Roman" w:eastAsia="Times New Roman" w:hAnsi="Times New Roman"/>
+                <w:sz w:val="22"/>
+                <w:szCs w:val="22"/>
+              </w:rPr>
+              <w:t xml:space="preserve">Gửi đồng thời bằng k6, kiểm tra dữ liệu trong cơ sở dữ liệu, chạy 10 vòng, đối chứng tuần tự, chạy lại trên máy thứ hai</w:t>
+            </w:r>
+          </w:p>
+        </w:tc>
+      </w:tr>
+      <w:tr>
+        <w:trPr>
+          <w:cantSplit/>
+          <w:tblHeader w:val="off"/>
+        </w:trPr>
+        <w:tc>
+          <w:tcPr>
+            <w:tcW w:type="dxa" w:w="2433"/>
+            <w:tcBorders>
+              <w:top w:val="single" w:color="000000" w:sz="4"/>
+              <w:left w:val="single" w:color="000000" w:sz="4"/>
+              <w:bottom w:val="single" w:color="000000" w:sz="4"/>
+              <w:right w:val="single" w:color="000000" w:sz="4"/>
+            </w:tcBorders>
+            <w:tcMar>
+              <w:top w:type="dxa" w:w="40"/>
+              <w:left w:type="dxa" w:w="90"/>
+              <w:bottom w:type="dxa" w:w="40"/>
+              <w:right w:type="dxa" w:w="90"/>
+            </w:tcMar>
+            <w:vAlign w:val="center"/>
+          </w:tcPr>
+          <w:p>
+            <w:pPr>
+              <w:spacing w:after="0" w:line="252"/>
+              <w:jc w:val="left"/>
+            </w:pPr>
+            <w:r>
+              <w:rPr>
+                <w:rFonts w:ascii="Times New Roman" w:cs="Times New Roman" w:eastAsia="Times New Roman" w:hAnsi="Times New Roman"/>
+                <w:sz w:val="22"/>
+                <w:szCs w:val="22"/>
+              </w:rPr>
+              <w:t xml:space="preserve">Kỹ thuật test</w:t>
+            </w:r>
+          </w:p>
+        </w:tc>
+        <w:tc>
+          <w:tcPr>
+            <w:tcW w:type="dxa" w:w="1622"/>
+            <w:tcBorders>
+              <w:top w:val="single" w:color="000000" w:sz="4"/>
+              <w:left w:val="single" w:color="000000" w:sz="4"/>
+              <w:bottom w:val="single" w:color="000000" w:sz="4"/>
+              <w:right w:val="single" w:color="000000" w:sz="4"/>
+            </w:tcBorders>
+            <w:tcMar>
+              <w:top w:type="dxa" w:w="40"/>
+              <w:left w:type="dxa" w:w="90"/>
+              <w:bottom w:type="dxa" w:w="40"/>
+              <w:right w:type="dxa" w:w="90"/>
+            </w:tcMar>
+            <w:vAlign w:val="center"/>
+          </w:tcPr>
+          <w:p>
+            <w:pPr>
+              <w:spacing w:after="0" w:line="252"/>
+              <w:jc w:val="center"/>
+            </w:pPr>
+            <w:r>
+              <w:rPr>
+                <w:rFonts w:ascii="Times New Roman" w:cs="Times New Roman" w:eastAsia="Times New Roman" w:hAnsi="Times New Roman"/>
+                <w:sz w:val="22"/>
+                <w:szCs w:val="22"/>
+              </w:rPr>
+              <w:t xml:space="preserve">2.1, 3.3.1</w:t>
+            </w:r>
+          </w:p>
+        </w:tc>
+        <w:tc>
+          <w:tcPr>
+            <w:tcW w:type="dxa" w:w="4732"/>
+            <w:tcBorders>
+              <w:top w:val="single" w:color="000000" w:sz="4"/>
+              <w:left w:val="single" w:color="000000" w:sz="4"/>
+              <w:bottom w:val="single" w:color="000000" w:sz="4"/>
+              <w:right w:val="single" w:color="000000" w:sz="4"/>
+            </w:tcBorders>
+            <w:tcMar>
+              <w:top w:type="dxa" w:w="40"/>
+              <w:left w:type="dxa" w:w="90"/>
+              <w:bottom w:type="dxa" w:w="40"/>
+              <w:right w:type="dxa" w:w="90"/>
+            </w:tcMar>
+            <w:vAlign w:val="center"/>
+          </w:tcPr>
+          <w:p>
+            <w:pPr>
+              <w:spacing w:after="0" w:line="252"/>
+              <w:jc w:val="left"/>
+            </w:pPr>
+            <w:r>
+              <w:rPr>
+                <w:rFonts w:ascii="Times New Roman" w:cs="Times New Roman" w:eastAsia="Times New Roman" w:hAnsi="Times New Roman"/>
+                <w:sz w:val="22"/>
+                <w:szCs w:val="22"/>
+              </w:rPr>
+              <w:t xml:space="preserve">Kiểm thử đồng thời (race condition): nguyên lý, lý do chọn, giới hạn</w:t>
+            </w:r>
+          </w:p>
+        </w:tc>
+      </w:tr>
+    </w:tbl>
+    <w:p>
+      <w:pPr>
+        <w:pStyle w:val="Caption"/>
+        <w:keepLines/>
+        <w:jc w:val="center"/>
+      </w:pPr>
+      <w:r>
+        <w:rPr>
+          <w:rFonts w:ascii="Times New Roman" w:cs="Times New Roman" w:eastAsia="Times New Roman" w:hAnsi="Times New Roman"/>
+          <w:i/>
+          <w:iCs/>
+        </w:rPr>
+        <w:t xml:space="preserve">Bảng </w:t>
+      </w:r>
+      <w:r>
+        <w:rPr>
+          <w:rFonts w:ascii="Times New Roman" w:cs="Times New Roman" w:eastAsia="Times New Roman" w:hAnsi="Times New Roman"/>
+          <w:i/>
+          <w:iCs/>
+        </w:rPr>
+        <w:fldChar w:fldCharType="begin"/>
+      </w:r>
+      <w:r>
+        <w:rPr>
+          <w:rFonts w:ascii="Times New Roman" w:cs="Times New Roman" w:eastAsia="Times New Roman" w:hAnsi="Times New Roman"/>
+          <w:i/>
+          <w:iCs/>
+        </w:rPr>
+        <w:instrText xml:space="preserve"> SEQ Bảng \* ARABIC </w:instrText>
+      </w:r>
+      <w:r>
+        <w:rPr>
+          <w:rFonts w:ascii="Times New Roman" w:cs="Times New Roman" w:eastAsia="Times New Roman" w:hAnsi="Times New Roman"/>
+          <w:i/>
+          <w:iCs/>
+        </w:rPr>
+        <w:fldChar w:fldCharType="separate"/>
+      </w:r>
+      <w:r>
+        <w:rPr>
+          <w:rFonts w:ascii="Times New Roman" w:cs="Times New Roman" w:eastAsia="Times New Roman" w:hAnsi="Times New Roman"/>
+          <w:i/>
+          <w:iCs/>
+        </w:rPr>
+        <w:t>3</w:t>
+      </w:r>
+      <w:r>
+        <w:rPr>
+          <w:rFonts w:ascii="Times New Roman" w:cs="Times New Roman" w:eastAsia="Times New Roman" w:hAnsi="Times New Roman"/>
+          <w:i/>
+          <w:iCs/>
+        </w:rPr>
+        <w:fldChar w:fldCharType="end"/>
+      </w:r>
+      <w:r>
+        <w:rPr>
+          <w:rFonts w:ascii="Times New Roman" w:cs="Times New Roman" w:eastAsia="Times New Roman" w:hAnsi="Times New Roman"/>
+          <w:i/>
+          <w:iCs/>
+        </w:rPr>
+        <w:t xml:space="preserve">. Đối chiếu các yêu cầu của giảng viên cho báo cáo giữa kỳ</w:t>
+      </w:r>
+    </w:p>
+    <w:p>
+      <w:pPr>
+        <w:spacing w:after="0" w:line="240"/>
+      </w:pPr>
+    </w:p>
+    <w:p>
+      <w:pPr>
         <w:pStyle w:val="Heading1"/>
         <w:pageBreakBefore/>
       </w:pPr>
@@ -4804,7 +5625,7 @@
         <w:rPr>
           <w:rFonts w:ascii="Times New Roman" w:cs="Times New Roman" w:eastAsia="Times New Roman" w:hAnsi="Times New Roman"/>
         </w:rPr>
-        <w:t xml:space="preserve"> (có tài khoản). Hình 1 và Bảng 3 trình bày các use case chính; đề tài tập trung vào nhóm use case của khách (UC01 đến UC03) vì đó là nơi nhiều người cùng tranh một tài nguyên.</w:t>
+        <w:t xml:space="preserve"> (có tài khoản). Hình 1 và Bảng 4 trình bày các use case chính; đề tài tập trung vào nhóm use case của khách (UC01 đến UC03) vì đó là nơi nhiều người cùng tranh một tài nguyên.</w:t>
       </w:r>
     </w:p>
     <w:p>
@@ -5796,7 +6617,7 @@
           <w:i/>
           <w:iCs/>
         </w:rPr>
-        <w:t>3</w:t>
+        <w:t>4</w:t>
       </w:r>
       <w:r>
         <w:rPr>
@@ -5842,7 +6663,7 @@
         <w:rPr>
           <w:rFonts w:ascii="Times New Roman" w:cs="Times New Roman" w:eastAsia="Times New Roman" w:hAnsi="Times New Roman"/>
         </w:rPr>
-        <w:t xml:space="preserve">Cal.com là monorepo với khoảng 7 950 tệp TypeScript. Bảng 4 liệt kê các thư mục chính liên quan đến luồng đặt lịch.</w:t>
+        <w:t xml:space="preserve">Cal.com là monorepo với khoảng 7 950 tệp TypeScript. Bảng 5 liệt kê các thư mục chính liên quan đến luồng đặt lịch.</w:t>
       </w:r>
     </w:p>
     <w:tbl>
@@ -6606,7 +7427,7 @@
           <w:i/>
           <w:iCs/>
         </w:rPr>
-        <w:t>4</w:t>
+        <w:t>5</w:t>
       </w:r>
       <w:r>
         <w:rPr>
@@ -7538,7 +8359,7 @@
           <w:i/>
           <w:iCs/>
         </w:rPr>
-        <w:t>5</w:t>
+        <w:t>6</w:t>
       </w:r>
       <w:r>
         <w:rPr>
@@ -9261,7 +10082,7 @@
           <w:i/>
           <w:iCs/>
         </w:rPr>
-        <w:t>6</w:t>
+        <w:t>7</w:t>
       </w:r>
       <w:r>
         <w:rPr>
@@ -9747,7 +10568,7 @@
                 <w:sz w:val="24"/>
                 <w:szCs w:val="24"/>
               </w:rPr>
-              <w:t xml:space="preserve">Bảng 8</w:t>
+              <w:t xml:space="preserve">Bảng 9</w:t>
             </w:r>
           </w:p>
         </w:tc>
@@ -10339,7 +11160,7 @@
           <w:i/>
           <w:iCs/>
         </w:rPr>
-        <w:t>7</w:t>
+        <w:t>8</w:t>
       </w:r>
       <w:r>
         <w:rPr>
@@ -11437,7 +12258,7 @@
           <w:i/>
           <w:iCs/>
         </w:rPr>
-        <w:t>8</w:t>
+        <w:t>9</w:t>
       </w:r>
       <w:r>
         <w:rPr>
@@ -11555,7 +12376,7 @@
         <w:rPr>
           <w:rFonts w:ascii="Times New Roman" w:cs="Times New Roman" w:eastAsia="Times New Roman" w:hAnsi="Times New Roman"/>
         </w:rPr>
-        <w:t xml:space="preserve"> (múi giờ UTC, rảnh cả ngày mọi ngày) và năm loại cuộc hẹn ở Bảng 9. Mỗi yêu cầu dùng một email người đặt khác nhau.</w:t>
+        <w:t xml:space="preserve"> (múi giờ UTC, rảnh cả ngày mọi ngày) và năm loại cuộc hẹn ở Bảng 10. Mỗi yêu cầu dùng một email người đặt khác nhau.</w:t>
       </w:r>
     </w:p>
     <w:tbl>
@@ -12241,7 +13062,7 @@
           <w:i/>
           <w:iCs/>
         </w:rPr>
-        <w:t>9</w:t>
+        <w:t>10</w:t>
       </w:r>
       <w:r>
         <w:rPr>
@@ -12274,7 +13095,7 @@
         <w:rPr>
           <w:rFonts w:ascii="Times New Roman" w:cs="Times New Roman" w:eastAsia="Times New Roman" w:hAnsi="Times New Roman"/>
         </w:rPr>
-        <w:t xml:space="preserve">Bảng 10 tổng hợp danh sách test case. Từ Bảng 11 đến Bảng 18 là đặc tả từng test case theo mẫu: mô tả, tác nhân, tiền điều kiện, input, kết quả mong đợi, invariant.</w:t>
+        <w:t xml:space="preserve">Bảng 11 tổng hợp danh sách test case. Từ Bảng 12 đến Bảng 19 là đặc tả từng test case theo mẫu: mô tả, tác nhân, tiền điều kiện, input, kết quả mong đợi, invariant.</w:t>
       </w:r>
     </w:p>
     <w:tbl>
@@ -13890,7 +14711,7 @@
           <w:i/>
           <w:iCs/>
         </w:rPr>
-        <w:t>10</w:t>
+        <w:t>11</w:t>
       </w:r>
       <w:r>
         <w:rPr>
@@ -14429,7 +15250,7 @@
           <w:i/>
           <w:iCs/>
         </w:rPr>
-        <w:t>11</w:t>
+        <w:t>12</w:t>
       </w:r>
       <w:r>
         <w:rPr>
@@ -14984,7 +15805,7 @@
           <w:i/>
           <w:iCs/>
         </w:rPr>
-        <w:t>12</w:t>
+        <w:t>13</w:t>
       </w:r>
       <w:r>
         <w:rPr>
@@ -15523,7 +16344,7 @@
           <w:i/>
           <w:iCs/>
         </w:rPr>
-        <w:t>13</w:t>
+        <w:t>14</w:t>
       </w:r>
       <w:r>
         <w:rPr>
@@ -16062,7 +16883,7 @@
           <w:i/>
           <w:iCs/>
         </w:rPr>
-        <w:t>14</w:t>
+        <w:t>15</w:t>
       </w:r>
       <w:r>
         <w:rPr>
@@ -16601,7 +17422,7 @@
           <w:i/>
           <w:iCs/>
         </w:rPr>
-        <w:t>15</w:t>
+        <w:t>16</w:t>
       </w:r>
       <w:r>
         <w:rPr>
@@ -17124,7 +17945,7 @@
           <w:i/>
           <w:iCs/>
         </w:rPr>
-        <w:t>16</w:t>
+        <w:t>17</w:t>
       </w:r>
       <w:r>
         <w:rPr>
@@ -17647,7 +18468,7 @@
           <w:i/>
           <w:iCs/>
         </w:rPr>
-        <w:t>17</w:t>
+        <w:t>18</w:t>
       </w:r>
       <w:r>
         <w:rPr>
@@ -18170,7 +18991,7 @@
           <w:i/>
           <w:iCs/>
         </w:rPr>
-        <w:t>18</w:t>
+        <w:t>19</w:t>
       </w:r>
       <w:r>
         <w:rPr>
@@ -18258,7 +19079,7 @@
         <w:rPr>
           <w:rFonts w:ascii="Times New Roman" w:cs="Times New Roman" w:eastAsia="Times New Roman" w:hAnsi="Times New Roman"/>
         </w:rPr>
-        <w:t xml:space="preserve">; Bảng 19 đến Bảng 21 liệt kê các cột được sử dụng. Hai ràng buộc duy nhất đáng chú ý nằm ở bảng </w:t>
+        <w:t xml:space="preserve">; Bảng 20 đến Bảng 22 liệt kê các cột được sử dụng. Hai ràng buộc duy nhất đáng chú ý nằm ở bảng </w:t>
       </w:r>
       <w:r>
         <w:rPr>
@@ -19394,7 +20215,7 @@
           <w:i/>
           <w:iCs/>
         </w:rPr>
-        <w:t>19</w:t>
+        <w:t>20</w:t>
       </w:r>
       <w:r>
         <w:rPr>
@@ -19999,7 +20820,7 @@
           <w:i/>
           <w:iCs/>
         </w:rPr>
-        <w:t>20</w:t>
+        <w:t>21</w:t>
       </w:r>
       <w:r>
         <w:rPr>
@@ -20604,7 +21425,7 @@
           <w:i/>
           <w:iCs/>
         </w:rPr>
-        <w:t>21</w:t>
+        <w:t>22</w:t>
       </w:r>
       <w:r>
         <w:rPr>
@@ -21439,7 +22260,7 @@
           <w:i/>
           <w:iCs/>
         </w:rPr>
-        <w:t>22</w:t>
+        <w:t>23</w:t>
       </w:r>
       <w:r>
         <w:rPr>
@@ -22799,7 +23620,7 @@
           <w:i/>
           <w:iCs/>
         </w:rPr>
-        <w:t>23</w:t>
+        <w:t>24</w:t>
       </w:r>
       <w:r>
         <w:rPr>
@@ -23071,7 +23892,7 @@
         <w:rPr>
           <w:rFonts w:ascii="Times New Roman" w:cs="Times New Roman" w:eastAsia="Times New Roman" w:hAnsi="Times New Roman"/>
         </w:rPr>
-        <w:t xml:space="preserve"> chạy lần lượt đặt lịch, đổi lịch, hủy lịch rồi đặt lại giờ vừa hủy. Kết quả ở Bảng 24: cả bốn bước đều trả HTTP 200 và trạng thái trong cơ sở dữ liệu đúng.</w:t>
+        <w:t xml:space="preserve"> chạy lần lượt đặt lịch, đổi lịch, hủy lịch rồi đặt lại giờ vừa hủy. Kết quả ở Bảng 25: cả bốn bước đều trả HTTP 200 và trạng thái trong cơ sở dữ liệu đúng.</w:t>
       </w:r>
     </w:p>
     <w:tbl>
@@ -23819,7 +24640,7 @@
           <w:i/>
           <w:iCs/>
         </w:rPr>
-        <w:t>24</w:t>
+        <w:t>25</w:t>
       </w:r>
       <w:r>
         <w:rPr>
@@ -23906,7 +24727,7 @@
         <w:rPr>
           <w:rFonts w:ascii="Times New Roman" w:cs="Times New Roman" w:eastAsia="Times New Roman" w:hAnsi="Times New Roman"/>
         </w:rPr>
-        <w:t xml:space="preserve"> và năm loại cuộc hẹn ở Bảng 9; có thể chạy nhiều lần mà không để lại dữ liệu cũ. Lệnh </w:t>
+        <w:t xml:space="preserve"> và năm loại cuộc hẹn ở Bảng 10; có thể chạy nhiều lần mà không để lại dữ liệu cũ. Lệnh </w:t>
       </w:r>
       <w:r>
         <w:rPr>
@@ -24851,7 +25672,7 @@
           <w:i/>
           <w:iCs/>
         </w:rPr>
-        <w:t>25</w:t>
+        <w:t>26</w:t>
       </w:r>
       <w:r>
         <w:rPr>
@@ -24964,7 +25785,7 @@
         <w:rPr>
           <w:rFonts w:ascii="Times New Roman" w:cs="Times New Roman" w:eastAsia="Times New Roman" w:hAnsi="Times New Roman"/>
         </w:rPr>
-        <w:t xml:space="preserve">Lượt chạy chính thức ngày 18/10/2026 trên máy macOS: 8 test case, mỗi test case 10 vòng ở mỗi chế độ. Bảng 26 tổng hợp kết quả; Hình 7 so sánh với máy Windows.</w:t>
+        <w:t xml:space="preserve">Lượt chạy chính thức ngày 18/10/2026 trên máy macOS: 8 test case, mỗi test case 10 vòng ở mỗi chế độ. Bảng 27 tổng hợp kết quả; Hình 7 so sánh với máy Windows.</w:t>
       </w:r>
     </w:p>
     <w:tbl>
@@ -26540,7 +27361,7 @@
           <w:i/>
           <w:iCs/>
         </w:rPr>
-        <w:t>26</w:t>
+        <w:t>27</w:t>
       </w:r>
       <w:r>
         <w:rPr>
@@ -26659,7 +27480,7 @@
         <w:rPr>
           <w:rFonts w:ascii="Times New Roman" w:cs="Times New Roman" w:eastAsia="Times New Roman" w:hAnsi="Times New Roman"/>
         </w:rPr>
-        <w:t xml:space="preserve">Thành viên Ngô Quốc Trường Vĩ chạy lại toàn bộ trên máy Windows 11 (Bảng 23) với cùng phiên bản mã. Kết quả khớp 8/8 với máy macOS: số vòng vi phạm và dữ liệu trong cơ sở dữ liệu ở vòng 1 giống nhau, trừ TC-05, nơi máy macOS nhận 9 booking chờ xác nhận và máy Windows nhận 10; cả hai đều vi phạm 10/10 vòng.</w:t>
+        <w:t xml:space="preserve">Thành viên Ngô Quốc Trường Vĩ chạy lại toàn bộ trên máy Windows 11 (Bảng 24) với cùng phiên bản mã. Kết quả khớp 8/8 với máy macOS: số vòng vi phạm và dữ liệu trong cơ sở dữ liệu ở vòng 1 giống nhau, trừ TC-05, nơi máy macOS nhận 9 booking chờ xác nhận và máy Windows nhận 10; cả hai đều vi phạm 10/10 vòng.</w:t>
       </w:r>
     </w:p>
     <w:p>
@@ -27199,7 +28020,7 @@
         <w:rPr>
           <w:rFonts w:ascii="Times New Roman" w:cs="Times New Roman" w:eastAsia="Times New Roman" w:hAnsi="Times New Roman"/>
         </w:rPr>
-        <w:t xml:space="preserve"> của từng lần chạy (Bảng 27).</w:t>
+        <w:t xml:space="preserve"> của từng lần chạy (Bảng 28).</w:t>
       </w:r>
     </w:p>
     <w:tbl>
@@ -28207,7 +29028,7 @@
           <w:i/>
           <w:iCs/>
         </w:rPr>
-        <w:t>27</w:t>
+        <w:t>28</w:t>
       </w:r>
       <w:r>
         <w:rPr>
@@ -28240,7 +29061,7 @@
         <w:rPr>
           <w:rFonts w:ascii="Times New Roman" w:cs="Times New Roman" w:eastAsia="Times New Roman" w:hAnsi="Times New Roman"/>
         </w:rPr>
-        <w:t xml:space="preserve">Chạy lại bộ test chính (cả đồng thời và tuần tự) tốn dưới 3 phút. Chi phí xây dựng bộ test khoảng 970 dòng mã (Node.js, k6, SQL). Về nhân lực, nhóm chưa theo dõi giờ làm của từng người; Bảng 28 là ước lượng khối lượng công việc, không phải số giờ đo thực tế.</w:t>
+        <w:t xml:space="preserve">Chạy lại bộ test chính (cả đồng thời và tuần tự) tốn dưới 3 phút. Chi phí xây dựng bộ test khoảng 970 dòng mã (Node.js, k6, SQL). Về nhân lực, nhóm chưa theo dõi giờ làm của từng người; Bảng 29 là ước lượng khối lượng công việc, không phải số giờ đo thực tế.</w:t>
       </w:r>
     </w:p>
     <w:tbl>
@@ -28918,7 +29739,7 @@
           <w:i/>
           <w:iCs/>
         </w:rPr>
-        <w:t>28</w:t>
+        <w:t>29</w:t>
       </w:r>
       <w:r>
         <w:rPr>
@@ -30265,7 +31086,7 @@
           <w:i/>
           <w:iCs/>
         </w:rPr>
-        <w:t>29</w:t>
+        <w:t>30</w:t>
       </w:r>
       <w:r>
         <w:rPr>
@@ -30325,7 +31146,7 @@
         <w:rPr>
           <w:rFonts w:ascii="Times New Roman" w:cs="Times New Roman" w:eastAsia="Times New Roman" w:hAnsi="Times New Roman"/>
         </w:rPr>
-        <w:t xml:space="preserve"> thuần trên Cal.com đang chạy, rồi đối chiếu dữ liệu trong cơ sở dữ liệu (Bảng 30). Ví dụ với D1, hai khách đặt hai giờ chồng nhau cùng lúc:</w:t>
+        <w:t xml:space="preserve"> thuần trên Cal.com đang chạy, rồi đối chiếu dữ liệu trong cơ sở dữ liệu (Bảng 31). Ví dụ với D1, hai khách đặt hai giờ chồng nhau cùng lúc:</w:t>
       </w:r>
     </w:p>
     <w:p>
@@ -31170,7 +31991,7 @@
           <w:i/>
           <w:iCs/>
         </w:rPr>
-        <w:t>30</w:t>
+        <w:t>31</w:t>
       </w:r>
       <w:r>
         <w:rPr>
@@ -31503,7 +32324,7 @@
         <w:rPr>
           <w:rFonts w:ascii="Times New Roman" w:cs="Times New Roman" w:eastAsia="Times New Roman" w:hAnsi="Times New Roman"/>
         </w:rPr>
-        <w:t xml:space="preserve">Để kiểm chứng nguyên nhân, nhóm thêm vào cơ sở dữ liệu test một ràng buộc loại trừ không cho hai booking hiệu lực (accepted hoặc pending) của cùng chủ lịch có khoảng giờ giao nhau [3], rồi chạy lại các test case. Kết quả ở Bảng 31.</w:t>
+        <w:t xml:space="preserve">Để kiểm chứng nguyên nhân, nhóm thêm vào cơ sở dữ liệu test một ràng buộc loại trừ không cho hai booking hiệu lực (accepted hoặc pending) của cùng chủ lịch có khoảng giờ giao nhau [3], rồi chạy lại các test case. Kết quả ở Bảng 32.</w:t>
       </w:r>
     </w:p>
     <w:tbl>
@@ -32117,7 +32938,7 @@
           <w:i/>
           <w:iCs/>
         </w:rPr>
-        <w:t>31</w:t>
+        <w:t>32</w:t>
       </w:r>
       <w:r>
         <w:rPr>
@@ -32311,7 +33132,7 @@
         <w:rPr>
           <w:rFonts w:ascii="Times New Roman" w:cs="Times New Roman" w:eastAsia="Times New Roman" w:hAnsi="Times New Roman"/>
         </w:rPr>
-        <w:t xml:space="preserve">Bảng 32 ghi nhiệm vụ và đóng góp của từng thành viên theo phân vai của nhóm.</w:t>
+        <w:t xml:space="preserve">Bảng 33 ghi nhiệm vụ và đóng góp của từng thành viên theo phân vai của nhóm.</w:t>
       </w:r>
     </w:p>
     <w:tbl>
@@ -33147,7 +33968,7 @@
           <w:i/>
           <w:iCs/>
         </w:rPr>
-        <w:t>32</w:t>
+        <w:t>33</w:t>
       </w:r>
       <w:r>
         <w:rPr>
@@ -33889,7 +34710,7 @@
           <w:i/>
           <w:iCs/>
         </w:rPr>
-        <w:t>33</w:t>
+        <w:t>34</w:t>
       </w:r>
       <w:r>
         <w:rPr>
@@ -34020,7 +34841,7 @@
         <w:rPr>
           <w:rFonts w:ascii="Times New Roman" w:cs="Times New Roman" w:eastAsia="Times New Roman" w:hAnsi="Times New Roman"/>
         </w:rPr>
-        <w:t xml:space="preserve">; so sánh kết quả với Bảng 26. Hướng dẫn riêng cho máy Windows nằm ở </w:t>
+        <w:t xml:space="preserve">; so sánh kết quả với Bảng 27. Hướng dẫn riêng cho máy Windows nằm ở </w:t>
       </w:r>
       <w:r>
         <w:rPr>
@@ -34768,7 +35589,7 @@
           <w:i/>
           <w:iCs/>
         </w:rPr>
-        <w:t>34</w:t>
+        <w:t>35</w:t>
       </w:r>
       <w:r>
         <w:rPr>
@@ -35658,7 +36479,7 @@
           <w:i/>
           <w:iCs/>
         </w:rPr>
-        <w:t>35</w:t>
+        <w:t>36</w:t>
       </w:r>
       <w:r>
         <w:rPr>

</xml_diff>